<commit_message>
Update client reports, ignore luxeenv, add pymongo to requirements
Co-Authored-By: Claude Sonnet 5 <noreply@anthropic.com>
</commit_message>
<xml_diff>
--- a/Client reports/LUXE-AI-Assistant-Technical-Design.docx
+++ b/Client reports/LUXE-AI-Assistant-Technical-Design.docx
@@ -1,13 +1,10 @@
 
 <file path=word/document.xml><?xml version="1.0" encoding="utf-8"?>
-<w:document xmlns:wpc="http://schemas.microsoft.com/office/word/2010/wordprocessingCanvas" xmlns:cx="http://schemas.microsoft.com/office/drawing/2014/chartex" xmlns:cx1="http://schemas.microsoft.com/office/drawing/2015/9/8/chartex" xmlns:cx2="http://schemas.microsoft.com/office/drawing/2015/10/21/chartex" xmlns:cx3="http://schemas.microsoft.com/office/drawing/2016/5/9/chartex" xmlns:cx4="http://schemas.microsoft.com/office/drawing/2016/5/10/chartex" xmlns:cx5="http://schemas.microsoft.com/office/drawing/2016/5/11/chartex" xmlns:cx6="http://schemas.microsoft.com/office/drawing/2016/5/12/chartex" xmlns:cx7="http://schemas.microsoft.com/office/drawing/2016/5/13/chartex" xmlns:cx8="http://schemas.microsoft.com/office/drawing/2016/5/14/chartex" xmlns:mc="http://schemas.openxmlformats.org/markup-compatibility/2006" xmlns:aink="http://schemas.microsoft.com/office/drawing/2016/ink" xmlns:am3d="http://schemas.microsoft.com/office/drawing/2017/model3d" xmlns:o="urn:schemas-microsoft-com:office:office" xmlns:oel="http://schemas.microsoft.com/office/2019/extlst" xmlns:r="http://schemas.openxmlformats.org/officeDocument/2006/relationships" xmlns:m="http://schemas.openxmlformats.org/officeDocument/2006/math" xmlns:v="urn:schemas-microsoft-com:vml" xmlns:wp14="http://schemas.microsoft.com/office/word/2010/wordprocessingDrawing" xmlns:wp="http://schemas.openxmlformats.org/drawingml/2006/wordprocessingDrawing" xmlns:w10="urn:schemas-microsoft-com:office:word" xmlns:w="http://schemas.openxmlformats.org/wordprocessingml/2006/main" xmlns:w14="http://schemas.microsoft.com/office/word/2010/wordml" xmlns:w15="http://schemas.microsoft.com/office/word/2012/wordml" xmlns:w16cex="http://schemas.microsoft.com/office/word/2018/wordml/cex" xmlns:w16cid="http://schemas.microsoft.com/office/word/2016/wordml/cid" xmlns:w16="http://schemas.microsoft.com/office/word/2018/wordml" xmlns:w16sdtdh="http://schemas.microsoft.com/office/word/2020/wordml/sdtdatahash" xmlns:w16se="http://schemas.microsoft.com/office/word/2015/wordml/symex" xmlns:wpg="http://schemas.microsoft.com/office/word/2010/wordprocessingGroup" xmlns:wpi="http://schemas.microsoft.com/office/word/2010/wordprocessingInk" xmlns:wne="http://schemas.microsoft.com/office/word/2006/wordml" xmlns:wps="http://schemas.microsoft.com/office/word/2010/wordprocessingShape" mc:Ignorable="w14 w15 w16se w16cid w16 w16cex w16sdtdh wp14">
+<w:document xmlns:wpc="http://schemas.microsoft.com/office/word/2010/wordprocessingCanvas" xmlns:cx="http://schemas.microsoft.com/office/drawing/2014/chartex" xmlns:cx1="http://schemas.microsoft.com/office/drawing/2015/9/8/chartex" xmlns:cx2="http://schemas.microsoft.com/office/drawing/2015/10/21/chartex" xmlns:cx3="http://schemas.microsoft.com/office/drawing/2016/5/9/chartex" xmlns:cx4="http://schemas.microsoft.com/office/drawing/2016/5/10/chartex" xmlns:cx5="http://schemas.microsoft.com/office/drawing/2016/5/11/chartex" xmlns:cx6="http://schemas.microsoft.com/office/drawing/2016/5/12/chartex" xmlns:cx7="http://schemas.microsoft.com/office/drawing/2016/5/13/chartex" xmlns:cx8="http://schemas.microsoft.com/office/drawing/2016/5/14/chartex" xmlns:mc="http://schemas.openxmlformats.org/markup-compatibility/2006" xmlns:aink="http://schemas.microsoft.com/office/drawing/2016/ink" xmlns:am3d="http://schemas.microsoft.com/office/drawing/2017/model3d" xmlns:o="urn:schemas-microsoft-com:office:office" xmlns:r="http://schemas.openxmlformats.org/officeDocument/2006/relationships" xmlns:m="http://schemas.openxmlformats.org/officeDocument/2006/math" xmlns:v="urn:schemas-microsoft-com:vml" xmlns:wp14="http://schemas.microsoft.com/office/word/2010/wordprocessingDrawing" xmlns:wp="http://schemas.openxmlformats.org/drawingml/2006/wordprocessingDrawing" xmlns:w10="urn:schemas-microsoft-com:office:word" xmlns:w="http://schemas.openxmlformats.org/wordprocessingml/2006/main" xmlns:w14="http://schemas.microsoft.com/office/word/2010/wordml" xmlns:w15="http://schemas.microsoft.com/office/word/2012/wordml" xmlns:w16cex="http://schemas.microsoft.com/office/word/2018/wordml/cex" xmlns:w16cid="http://schemas.microsoft.com/office/word/2016/wordml/cid" xmlns:w16="http://schemas.microsoft.com/office/word/2018/wordml" xmlns:w16sdtdh="http://schemas.microsoft.com/office/word/2020/wordml/sdtdatahash" xmlns:w16se="http://schemas.microsoft.com/office/word/2015/wordml/symex" xmlns:wpg="http://schemas.microsoft.com/office/word/2010/wordprocessingGroup" xmlns:wpi="http://schemas.microsoft.com/office/word/2010/wordprocessingInk" xmlns:wne="http://schemas.microsoft.com/office/word/2006/wordml" xmlns:wps="http://schemas.microsoft.com/office/word/2010/wordprocessingShape" mc:Ignorable="w14 w15 w16se w16cid w16 w16cex w16sdtdh wp14">
   <w:body>
     <w:p>
       <w:pPr>
         <w:spacing w:before="2400"/>
-        <w:rPr>
-          <w:rFonts w:hint="eastAsia"/>
-        </w:rPr>
       </w:pPr>
       <w:r>
         <w:rPr>
@@ -20,11 +17,6 @@
       </w:r>
     </w:p>
     <w:p>
-      <w:pPr>
-        <w:rPr>
-          <w:rFonts w:hint="eastAsia"/>
-        </w:rPr>
-      </w:pPr>
       <w:r>
         <w:rPr>
           <w:rFonts w:ascii="Segoe UI Semibold" w:hAnsi="Segoe UI Semibold" w:cs="Segoe UI Semibold"/>
@@ -37,17 +29,11 @@
     <w:p>
       <w:pPr>
         <w:spacing w:after="480"/>
-        <w:rPr>
-          <w:rFonts w:hint="eastAsia"/>
-        </w:rPr>
       </w:pPr>
     </w:p>
     <w:p>
       <w:pPr>
         <w:spacing w:after="60"/>
-        <w:rPr>
-          <w:rFonts w:hint="eastAsia"/>
-        </w:rPr>
       </w:pPr>
       <w:r>
         <w:rPr>
@@ -56,15 +42,15 @@
         <w:t xml:space="preserve">Author:  </w:t>
       </w:r>
       <w:r>
-        <w:t>Forward-Deployed AI Engineer</w:t>
+        <w:t>Divesh jadhwani</w:t>
+      </w:r>
+      <w:r>
+        <w:t xml:space="preserve"> FDE</w:t>
       </w:r>
     </w:p>
     <w:p>
       <w:pPr>
         <w:spacing w:after="60"/>
-        <w:rPr>
-          <w:rFonts w:hint="eastAsia"/>
-        </w:rPr>
       </w:pPr>
       <w:r>
         <w:rPr>
@@ -79,9 +65,6 @@
     <w:p>
       <w:pPr>
         <w:spacing w:after="60"/>
-        <w:rPr>
-          <w:rFonts w:hint="eastAsia"/>
-        </w:rPr>
       </w:pPr>
       <w:r>
         <w:rPr>
@@ -96,9 +79,6 @@
     <w:p>
       <w:pPr>
         <w:spacing w:after="60"/>
-        <w:rPr>
-          <w:rFonts w:hint="eastAsia"/>
-        </w:rPr>
       </w:pPr>
       <w:r>
         <w:rPr>
@@ -111,21 +91,11 @@
       </w:r>
     </w:p>
     <w:p>
-      <w:pPr>
-        <w:rPr>
-          <w:rFonts w:hint="eastAsia"/>
-        </w:rPr>
-      </w:pPr>
       <w:r>
         <w:br w:type="page"/>
       </w:r>
     </w:p>
     <w:p>
-      <w:pPr>
-        <w:rPr>
-          <w:rFonts w:hint="eastAsia"/>
-        </w:rPr>
-      </w:pPr>
       <w:r>
         <w:rPr>
           <w:rFonts w:ascii="Segoe UI Semibold" w:hAnsi="Segoe UI Semibold" w:cs="Segoe UI Semibold"/>
@@ -1711,21 +1681,11 @@
       </w:hyperlink>
     </w:p>
     <w:p>
-      <w:pPr>
-        <w:rPr>
-          <w:rFonts w:hint="eastAsia"/>
-        </w:rPr>
-      </w:pPr>
       <w:r>
         <w:fldChar w:fldCharType="end"/>
       </w:r>
     </w:p>
     <w:p>
-      <w:pPr>
-        <w:rPr>
-          <w:rFonts w:hint="eastAsia"/>
-        </w:rPr>
-      </w:pPr>
       <w:r>
         <w:br w:type="page"/>
       </w:r>
@@ -1742,21 +1702,11 @@
       <w:bookmarkEnd w:id="0"/>
     </w:p>
     <w:p>
-      <w:pPr>
-        <w:rPr>
-          <w:rFonts w:hint="eastAsia"/>
-        </w:rPr>
-      </w:pPr>
       <w:r>
         <w:t>The LUXE AI Shopping Assistant adds a natural-language product-discovery layer to the existing storefront. It is an addition, not a rewrite: the catalog, cart, checkout, accounts and admin are untouched. The assistant is a chat widget on the front end and a single new endpoint on the back end.</w:t>
       </w:r>
     </w:p>
     <w:p>
-      <w:pPr>
-        <w:rPr>
-          <w:rFonts w:hint="eastAsia"/>
-        </w:rPr>
-      </w:pPr>
       <w:r>
         <w:t>The design has three concerns: a static presentation layer, a stateless orchestration pipeline, and a read-only data-access path. Reasoning happens only in the orchestration layer; the language model is never given direct access to the database.</w:t>
       </w:r>
@@ -1775,19 +1725,16 @@
       <w:pPr>
         <w:spacing w:before="160" w:after="40"/>
         <w:jc w:val="center"/>
-        <w:rPr>
-          <w:rFonts w:hint="eastAsia"/>
-        </w:rPr>
       </w:pPr>
       <w:r>
         <w:rPr>
           <w:noProof/>
         </w:rPr>
         <w:drawing>
-          <wp:inline distT="0" distB="0" distL="0" distR="0" wp14:anchorId="362CDC58" wp14:editId="720DFD4C">
-            <wp:extent cx="5760720" cy="2607828"/>
-            <wp:effectExtent l="0" t="0" r="0" b="0"/>
-            <wp:docPr id="1" name="Picture 1"/>
+          <wp:inline distT="0" distB="0" distL="0" distR="0" wp14:anchorId="3C07F7E2" wp14:editId="06D90EE7">
+            <wp:extent cx="5717540" cy="2587625"/>
+            <wp:effectExtent l="0" t="0" r="0" b="3175"/>
+            <wp:docPr id="4" name="Picture 4"/>
             <wp:cNvGraphicFramePr>
               <a:graphicFrameLocks xmlns:a="http://schemas.openxmlformats.org/drawingml/2006/main" noChangeAspect="1"/>
             </wp:cNvGraphicFramePr>
@@ -1795,23 +1742,36 @@
               <a:graphicData uri="http://schemas.openxmlformats.org/drawingml/2006/picture">
                 <pic:pic xmlns:pic="http://schemas.openxmlformats.org/drawingml/2006/picture">
                   <pic:nvPicPr>
-                    <pic:cNvPr id="0" name="tdd_d1_architecture.png"/>
-                    <pic:cNvPicPr/>
+                    <pic:cNvPr id="0" name="Picture 1"/>
+                    <pic:cNvPicPr>
+                      <a:picLocks noChangeAspect="1" noChangeArrowheads="1"/>
+                    </pic:cNvPicPr>
                   </pic:nvPicPr>
                   <pic:blipFill>
-                    <a:blip r:embed="rId6"/>
+                    <a:blip r:embed="rId6">
+                      <a:extLst>
+                        <a:ext uri="{28A0092B-C50C-407E-A947-70E740481C1C}">
+                          <a14:useLocalDpi xmlns:a14="http://schemas.microsoft.com/office/drawing/2010/main" val="0"/>
+                        </a:ext>
+                      </a:extLst>
+                    </a:blip>
+                    <a:srcRect/>
                     <a:stretch>
                       <a:fillRect/>
                     </a:stretch>
                   </pic:blipFill>
-                  <pic:spPr>
+                  <pic:spPr bwMode="auto">
                     <a:xfrm>
                       <a:off x="0" y="0"/>
-                      <a:ext cx="5760720" cy="2607828"/>
+                      <a:ext cx="5717540" cy="2587625"/>
                     </a:xfrm>
                     <a:prstGeom prst="rect">
                       <a:avLst/>
                     </a:prstGeom>
+                    <a:noFill/>
+                    <a:ln>
+                      <a:noFill/>
+                    </a:ln>
                   </pic:spPr>
                 </pic:pic>
               </a:graphicData>
@@ -1823,9 +1783,6 @@
     <w:p>
       <w:pPr>
         <w:spacing w:before="40" w:after="240"/>
-        <w:rPr>
-          <w:rFonts w:hint="eastAsia"/>
-        </w:rPr>
       </w:pPr>
       <w:r>
         <w:rPr>
@@ -1877,9 +1834,6 @@
           <w:p>
             <w:pPr>
               <w:spacing w:after="40"/>
-              <w:rPr>
-                <w:rFonts w:hint="eastAsia"/>
-              </w:rPr>
             </w:pPr>
             <w:r>
               <w:rPr>
@@ -1899,9 +1853,6 @@
           <w:p>
             <w:pPr>
               <w:spacing w:after="40"/>
-              <w:rPr>
-                <w:rFonts w:hint="eastAsia"/>
-              </w:rPr>
             </w:pPr>
             <w:r>
               <w:rPr>
@@ -1925,9 +1876,6 @@
           <w:p>
             <w:pPr>
               <w:spacing w:after="40" w:line="276" w:lineRule="auto"/>
-              <w:rPr>
-                <w:rFonts w:hint="eastAsia"/>
-              </w:rPr>
             </w:pPr>
             <w:r>
               <w:rPr>
@@ -1944,21 +1892,12 @@
           <w:p>
             <w:pPr>
               <w:spacing w:after="40" w:line="276" w:lineRule="auto"/>
-              <w:rPr>
-                <w:rFonts w:hint="eastAsia"/>
-              </w:rPr>
             </w:pPr>
             <w:r>
               <w:rPr>
                 <w:sz w:val="19"/>
               </w:rPr>
-              <w:t xml:space="preserve">Static ES-module chat widget mounted once on every page. Holds only UI state (open/closed, message list). Escapes every value from the model or </w:t>
-            </w:r>
-            <w:r>
-              <w:rPr>
-                <w:sz w:val="19"/>
-              </w:rPr>
-              <w:t>the user before it touches the DOM. No build step.</w:t>
+              <w:t>Static ES-module chat widget mounted once on every page. Holds only UI state (open/closed, message list). Escapes every value from the model or the user before it touches the DOM. No build step.</w:t>
             </w:r>
           </w:p>
         </w:tc>
@@ -1974,9 +1913,6 @@
           <w:p>
             <w:pPr>
               <w:spacing w:after="40" w:line="276" w:lineRule="auto"/>
-              <w:rPr>
-                <w:rFonts w:hint="eastAsia"/>
-              </w:rPr>
             </w:pPr>
             <w:r>
               <w:rPr>
@@ -1993,9 +1929,6 @@
           <w:p>
             <w:pPr>
               <w:spacing w:after="40" w:line="276" w:lineRule="auto"/>
-              <w:rPr>
-                <w:rFonts w:hint="eastAsia"/>
-              </w:rPr>
             </w:pPr>
             <w:r>
               <w:rPr>
@@ -2017,9 +1950,6 @@
           <w:p>
             <w:pPr>
               <w:spacing w:after="40" w:line="276" w:lineRule="auto"/>
-              <w:rPr>
-                <w:rFonts w:hint="eastAsia"/>
-              </w:rPr>
             </w:pPr>
             <w:r>
               <w:rPr>
@@ -2036,9 +1966,6 @@
           <w:p>
             <w:pPr>
               <w:spacing w:after="40" w:line="276" w:lineRule="auto"/>
-              <w:rPr>
-                <w:rFonts w:hint="eastAsia"/>
-              </w:rPr>
             </w:pPr>
             <w:r>
               <w:rPr>
@@ -2060,9 +1987,6 @@
           <w:p>
             <w:pPr>
               <w:spacing w:after="40" w:line="276" w:lineRule="auto"/>
-              <w:rPr>
-                <w:rFonts w:hint="eastAsia"/>
-              </w:rPr>
             </w:pPr>
             <w:r>
               <w:rPr>
@@ -2079,9 +2003,6 @@
           <w:p>
             <w:pPr>
               <w:spacing w:after="40" w:line="276" w:lineRule="auto"/>
-              <w:rPr>
-                <w:rFonts w:hint="eastAsia"/>
-              </w:rPr>
             </w:pPr>
             <w:r>
               <w:rPr>
@@ -2096,9 +2017,6 @@
     <w:p>
       <w:pPr>
         <w:spacing w:after="80"/>
-        <w:rPr>
-          <w:rFonts w:hint="eastAsia"/>
-        </w:rPr>
       </w:pPr>
     </w:p>
     <w:p>
@@ -2113,16 +2031,8 @@
       <w:bookmarkEnd w:id="3"/>
     </w:p>
     <w:p>
-      <w:pPr>
-        <w:rPr>
-          <w:rFonts w:hint="eastAsia"/>
-        </w:rPr>
-      </w:pPr>
       <w:r>
-        <w:t xml:space="preserve">The orchestration tier keeps behaviour deterministic around a probabilistic core. One function owns the whole lifecycle of a </w:t>
-      </w:r>
-      <w:r>
-        <w:t>message.</w:t>
+        <w:t>The orchestration tier keeps behaviour deterministic around a probabilistic core. One function owns the whole lifecycle of a message.</w:t>
       </w:r>
     </w:p>
     <w:p>
@@ -2139,9 +2049,6 @@
       <w:pPr>
         <w:spacing w:before="160" w:after="40"/>
         <w:jc w:val="center"/>
-        <w:rPr>
-          <w:rFonts w:hint="eastAsia"/>
-        </w:rPr>
       </w:pPr>
       <w:r>
         <w:rPr>
@@ -2187,9 +2094,6 @@
     <w:p>
       <w:pPr>
         <w:spacing w:before="40" w:after="240"/>
-        <w:rPr>
-          <w:rFonts w:hint="eastAsia"/>
-        </w:rPr>
       </w:pPr>
       <w:r>
         <w:rPr>
@@ -2204,9 +2108,6 @@
       <w:pPr>
         <w:pStyle w:val="ListBullet"/>
         <w:spacing w:after="60" w:line="288" w:lineRule="auto"/>
-        <w:rPr>
-          <w:rFonts w:hint="eastAsia"/>
-        </w:rPr>
       </w:pPr>
       <w:r>
         <w:rPr>
@@ -2222,9 +2123,6 @@
       <w:pPr>
         <w:pStyle w:val="ListBullet"/>
         <w:spacing w:after="60" w:line="288" w:lineRule="auto"/>
-        <w:rPr>
-          <w:rFonts w:hint="eastAsia"/>
-        </w:rPr>
       </w:pPr>
       <w:r>
         <w:rPr>
@@ -2240,9 +2138,6 @@
       <w:pPr>
         <w:pStyle w:val="ListBullet"/>
         <w:spacing w:after="60" w:line="288" w:lineRule="auto"/>
-        <w:rPr>
-          <w:rFonts w:hint="eastAsia"/>
-        </w:rPr>
       </w:pPr>
       <w:r>
         <w:rPr>
@@ -2258,9 +2153,6 @@
       <w:pPr>
         <w:pStyle w:val="ListBullet"/>
         <w:spacing w:after="60" w:line="288" w:lineRule="auto"/>
-        <w:rPr>
-          <w:rFonts w:hint="eastAsia"/>
-        </w:rPr>
       </w:pPr>
       <w:r>
         <w:rPr>
@@ -2276,9 +2168,6 @@
       <w:pPr>
         <w:pStyle w:val="ListBullet"/>
         <w:spacing w:after="60" w:line="288" w:lineRule="auto"/>
-        <w:rPr>
-          <w:rFonts w:hint="eastAsia"/>
-        </w:rPr>
       </w:pPr>
       <w:r>
         <w:rPr>
@@ -2294,9 +2183,6 @@
       <w:pPr>
         <w:spacing w:before="160" w:after="40"/>
         <w:jc w:val="center"/>
-        <w:rPr>
-          <w:rFonts w:hint="eastAsia"/>
-        </w:rPr>
       </w:pPr>
       <w:r>
         <w:rPr>
@@ -2343,9 +2229,6 @@
     <w:p>
       <w:pPr>
         <w:spacing w:before="40" w:after="240"/>
-        <w:rPr>
-          <w:rFonts w:hint="eastAsia"/>
-        </w:rPr>
       </w:pPr>
       <w:r>
         <w:rPr>
@@ -2370,9 +2253,6 @@
       <w:pPr>
         <w:pStyle w:val="ListBullet"/>
         <w:spacing w:after="60" w:line="288" w:lineRule="auto"/>
-        <w:rPr>
-          <w:rFonts w:hint="eastAsia"/>
-        </w:rPr>
       </w:pPr>
       <w:r>
         <w:rPr>
@@ -2388,9 +2268,6 @@
       <w:pPr>
         <w:pStyle w:val="ListBullet"/>
         <w:spacing w:after="60" w:line="288" w:lineRule="auto"/>
-        <w:rPr>
-          <w:rFonts w:hint="eastAsia"/>
-        </w:rPr>
       </w:pPr>
       <w:r>
         <w:rPr>
@@ -2406,9 +2283,6 @@
       <w:pPr>
         <w:pStyle w:val="ListBullet"/>
         <w:spacing w:after="60" w:line="288" w:lineRule="auto"/>
-        <w:rPr>
-          <w:rFonts w:hint="eastAsia"/>
-        </w:rPr>
       </w:pPr>
       <w:r>
         <w:rPr>
@@ -2421,11 +2295,6 @@
       </w:r>
     </w:p>
     <w:p>
-      <w:pPr>
-        <w:rPr>
-          <w:rFonts w:hint="eastAsia"/>
-        </w:rPr>
-      </w:pPr>
       <w:r>
         <w:t>The model never writes a query string. It chooses values for four named parameters; the tool does the rest. This is the core of the security model (section 3.1).</w:t>
       </w:r>
@@ -2444,9 +2313,6 @@
       <w:pPr>
         <w:pStyle w:val="ListBullet"/>
         <w:spacing w:after="60" w:line="288" w:lineRule="auto"/>
-        <w:rPr>
-          <w:rFonts w:hint="eastAsia"/>
-        </w:rPr>
       </w:pPr>
       <w:r>
         <w:rPr>
@@ -2462,9 +2328,6 @@
       <w:pPr>
         <w:pStyle w:val="ListBullet"/>
         <w:spacing w:after="60" w:line="288" w:lineRule="auto"/>
-        <w:rPr>
-          <w:rFonts w:hint="eastAsia"/>
-        </w:rPr>
       </w:pPr>
       <w:r>
         <w:rPr>
@@ -2480,9 +2343,6 @@
       <w:pPr>
         <w:pStyle w:val="ListBullet"/>
         <w:spacing w:after="60" w:line="288" w:lineRule="auto"/>
-        <w:rPr>
-          <w:rFonts w:hint="eastAsia"/>
-        </w:rPr>
       </w:pPr>
       <w:r>
         <w:rPr>
@@ -2498,9 +2358,6 @@
       <w:pPr>
         <w:pStyle w:val="ListBullet"/>
         <w:spacing w:after="60" w:line="288" w:lineRule="auto"/>
-        <w:rPr>
-          <w:rFonts w:hint="eastAsia"/>
-        </w:rPr>
       </w:pPr>
       <w:r>
         <w:rPr>
@@ -2524,11 +2381,6 @@
       <w:bookmarkEnd w:id="7"/>
     </w:p>
     <w:p>
-      <w:pPr>
-        <w:rPr>
-          <w:rFonts w:hint="eastAsia"/>
-        </w:rPr>
-      </w:pPr>
       <w:r>
         <w:t>The security boundary is the query surface, not the network. The assistant is assumed to be reachable; what matters is that it can only ever do one safe thing.</w:t>
       </w:r>
@@ -2547,9 +2399,6 @@
       <w:pPr>
         <w:pStyle w:val="ListBullet"/>
         <w:spacing w:after="60" w:line="288" w:lineRule="auto"/>
-        <w:rPr>
-          <w:rFonts w:hint="eastAsia"/>
-        </w:rPr>
       </w:pPr>
       <w:r>
         <w:t>The agent's tool reads a single collection, products, and nothing else.</w:t>
@@ -2559,9 +2408,6 @@
       <w:pPr>
         <w:pStyle w:val="ListBullet"/>
         <w:spacing w:after="60" w:line="288" w:lineRule="auto"/>
-        <w:rPr>
-          <w:rFonts w:hint="eastAsia"/>
-        </w:rPr>
       </w:pPr>
       <w:r>
         <w:t>The query is assembled only from the four typed tool arguments. There is no code path from model output to a raw query, an aggregation, or a write.</w:t>
@@ -2571,9 +2417,6 @@
       <w:pPr>
         <w:pStyle w:val="ListBullet"/>
         <w:spacing w:after="60" w:line="288" w:lineRule="auto"/>
-        <w:rPr>
-          <w:rFonts w:hint="eastAsia"/>
-        </w:rPr>
       </w:pPr>
       <w:r>
         <w:t>Every read is capped at 8 documents.</w:t>
@@ -2583,20 +2426,12 @@
       <w:pPr>
         <w:pStyle w:val="ListBullet"/>
         <w:spacing w:after="60" w:line="288" w:lineRule="auto"/>
-        <w:rPr>
-          <w:rFonts w:hint="eastAsia"/>
-        </w:rPr>
       </w:pPr>
       <w:r>
         <w:t>Raw base64 image blobs are removed from every document before it leaves the tool, so nothing oversized or unexpected reaches the model or the client.</w:t>
       </w:r>
     </w:p>
     <w:p>
-      <w:pPr>
-        <w:rPr>
-          <w:rFonts w:hint="eastAsia"/>
-        </w:rPr>
-      </w:pPr>
       <w:r>
         <w:t>Because the model cannot author queries, the classic prompt-injection-to-SQL (or to NoSQL) risk does not exist here — there is no query for an attacker's text to reach.</w:t>
       </w:r>
@@ -2612,11 +2447,6 @@
       <w:bookmarkEnd w:id="9"/>
     </w:p>
     <w:p>
-      <w:pPr>
-        <w:rPr>
-          <w:rFonts w:hint="eastAsia"/>
-        </w:rPr>
-      </w:pPr>
       <w:r>
         <w:t>Two independent screens, one on the way in and one on the way out, each using a purpose-built safety model:</w:t>
       </w:r>
@@ -2653,9 +2483,6 @@
           <w:p>
             <w:pPr>
               <w:spacing w:after="40"/>
-              <w:rPr>
-                <w:rFonts w:hint="eastAsia"/>
-              </w:rPr>
             </w:pPr>
             <w:r>
               <w:rPr>
@@ -2675,9 +2502,6 @@
           <w:p>
             <w:pPr>
               <w:spacing w:after="40"/>
-              <w:rPr>
-                <w:rFonts w:hint="eastAsia"/>
-              </w:rPr>
             </w:pPr>
             <w:r>
               <w:rPr>
@@ -2697,9 +2521,6 @@
           <w:p>
             <w:pPr>
               <w:spacing w:after="40"/>
-              <w:rPr>
-                <w:rFonts w:hint="eastAsia"/>
-              </w:rPr>
             </w:pPr>
             <w:r>
               <w:rPr>
@@ -2723,9 +2544,6 @@
           <w:p>
             <w:pPr>
               <w:spacing w:after="40" w:line="276" w:lineRule="auto"/>
-              <w:rPr>
-                <w:rFonts w:hint="eastAsia"/>
-              </w:rPr>
             </w:pPr>
             <w:r>
               <w:rPr>
@@ -2742,9 +2560,6 @@
           <w:p>
             <w:pPr>
               <w:spacing w:after="40" w:line="276" w:lineRule="auto"/>
-              <w:rPr>
-                <w:rFonts w:hint="eastAsia"/>
-              </w:rPr>
             </w:pPr>
             <w:r>
               <w:rPr>
@@ -2761,21 +2576,12 @@
           <w:p>
             <w:pPr>
               <w:spacing w:after="40" w:line="276" w:lineRule="auto"/>
-              <w:rPr>
-                <w:rFonts w:hint="eastAsia"/>
-              </w:rPr>
             </w:pPr>
             <w:r>
               <w:rPr>
                 <w:sz w:val="19"/>
               </w:rPr>
-              <w:t xml:space="preserve">Prompt injection and </w:t>
-            </w:r>
-            <w:r>
-              <w:rPr>
-                <w:sz w:val="19"/>
-              </w:rPr>
-              <w:t>jailbreak attempts. Returns a likelihood score; blocked at ≥ 0.5.</w:t>
+              <w:t>Prompt injection and jailbreak attempts. Returns a likelihood score; blocked at ≥ 0.5.</w:t>
             </w:r>
           </w:p>
         </w:tc>
@@ -2791,9 +2597,6 @@
           <w:p>
             <w:pPr>
               <w:spacing w:after="40" w:line="276" w:lineRule="auto"/>
-              <w:rPr>
-                <w:rFonts w:hint="eastAsia"/>
-              </w:rPr>
             </w:pPr>
             <w:r>
               <w:rPr>
@@ -2810,9 +2613,6 @@
           <w:p>
             <w:pPr>
               <w:spacing w:after="40" w:line="276" w:lineRule="auto"/>
-              <w:rPr>
-                <w:rFonts w:hint="eastAsia"/>
-              </w:rPr>
             </w:pPr>
             <w:r>
               <w:rPr>
@@ -2829,9 +2629,6 @@
           <w:p>
             <w:pPr>
               <w:spacing w:after="40" w:line="276" w:lineRule="auto"/>
-              <w:rPr>
-                <w:rFonts w:hint="eastAsia"/>
-              </w:rPr>
             </w:pPr>
             <w:r>
               <w:rPr>
@@ -2853,9 +2650,6 @@
           <w:p>
             <w:pPr>
               <w:spacing w:after="40" w:line="276" w:lineRule="auto"/>
-              <w:rPr>
-                <w:rFonts w:hint="eastAsia"/>
-              </w:rPr>
             </w:pPr>
             <w:r>
               <w:rPr>
@@ -2872,9 +2666,6 @@
           <w:p>
             <w:pPr>
               <w:spacing w:after="40" w:line="276" w:lineRule="auto"/>
-              <w:rPr>
-                <w:rFonts w:hint="eastAsia"/>
-              </w:rPr>
             </w:pPr>
             <w:r>
               <w:rPr>
@@ -2891,9 +2682,6 @@
           <w:p>
             <w:pPr>
               <w:spacing w:after="40" w:line="276" w:lineRule="auto"/>
-              <w:rPr>
-                <w:rFonts w:hint="eastAsia"/>
-              </w:rPr>
             </w:pPr>
             <w:r>
               <w:rPr>
@@ -2908,33 +2696,21 @@
     <w:p>
       <w:pPr>
         <w:spacing w:after="80"/>
-        <w:rPr>
-          <w:rFonts w:hint="eastAsia"/>
-        </w:rPr>
       </w:pPr>
     </w:p>
     <w:p>
       <w:pPr>
         <w:pStyle w:val="ListBullet"/>
         <w:spacing w:after="60" w:line="288" w:lineRule="auto"/>
-        <w:rPr>
-          <w:rFonts w:hint="eastAsia"/>
-        </w:rPr>
       </w:pPr>
       <w:r>
-        <w:t xml:space="preserve">Each policy is a </w:t>
-      </w:r>
-      <w:r>
-        <w:t>plain-language document supplied by us, so it can be tuned for LUXE without retraining anything.</w:t>
+        <w:t>Each policy is a plain-language document supplied by us, so it can be tuned for LUXE without retraining anything.</w:t>
       </w:r>
     </w:p>
     <w:p>
       <w:pPr>
         <w:pStyle w:val="ListBullet"/>
         <w:spacing w:after="60" w:line="288" w:lineRule="auto"/>
-        <w:rPr>
-          <w:rFonts w:hint="eastAsia"/>
-        </w:rPr>
       </w:pPr>
       <w:r>
         <w:t>Both screens judge the text on its own and explicitly ignore any instructions embedded inside it.</w:t>
@@ -2944,9 +2720,6 @@
       <w:pPr>
         <w:pStyle w:val="ListBullet"/>
         <w:spacing w:after="60" w:line="288" w:lineRule="auto"/>
-        <w:rPr>
-          <w:rFonts w:hint="eastAsia"/>
-        </w:rPr>
       </w:pPr>
       <w:r>
         <w:t>Ordinary blunt messages (“your return policy is rubbish, give me a discount”) are allowed through — only genuine attacks and unsafe content are blocked.</w:t>
@@ -2966,9 +2739,6 @@
       <w:pPr>
         <w:pStyle w:val="ListBullet"/>
         <w:spacing w:after="60" w:line="288" w:lineRule="auto"/>
-        <w:rPr>
-          <w:rFonts w:hint="eastAsia"/>
-        </w:rPr>
       </w:pPr>
       <w:r>
         <w:rPr>
@@ -2984,9 +2754,6 @@
       <w:pPr>
         <w:pStyle w:val="ListBullet"/>
         <w:spacing w:after="60" w:line="288" w:lineRule="auto"/>
-        <w:rPr>
-          <w:rFonts w:hint="eastAsia"/>
-        </w:rPr>
       </w:pPr>
       <w:r>
         <w:rPr>
@@ -3003,9 +2770,6 @@
       <w:pPr>
         <w:pStyle w:val="ListBullet"/>
         <w:spacing w:after="60" w:line="288" w:lineRule="auto"/>
-        <w:rPr>
-          <w:rFonts w:hint="eastAsia"/>
-        </w:rPr>
       </w:pPr>
       <w:r>
         <w:rPr>
@@ -3031,9 +2795,6 @@
       <w:pPr>
         <w:pStyle w:val="ListBullet"/>
         <w:spacing w:after="60" w:line="288" w:lineRule="auto"/>
-        <w:rPr>
-          <w:rFonts w:hint="eastAsia"/>
-        </w:rPr>
       </w:pPr>
       <w:r>
         <w:rPr>
@@ -3049,9 +2810,6 @@
       <w:pPr>
         <w:pStyle w:val="ListBullet"/>
         <w:spacing w:after="60" w:line="288" w:lineRule="auto"/>
-        <w:rPr>
-          <w:rFonts w:hint="eastAsia"/>
-        </w:rPr>
       </w:pPr>
       <w:r>
         <w:rPr>
@@ -3067,9 +2825,6 @@
       <w:pPr>
         <w:pStyle w:val="ListBullet"/>
         <w:spacing w:after="60" w:line="288" w:lineRule="auto"/>
-        <w:rPr>
-          <w:rFonts w:hint="eastAsia"/>
-        </w:rPr>
       </w:pPr>
       <w:r>
         <w:rPr>
@@ -3132,9 +2887,6 @@
           <w:p>
             <w:pPr>
               <w:spacing w:after="40"/>
-              <w:rPr>
-                <w:rFonts w:hint="eastAsia"/>
-              </w:rPr>
             </w:pPr>
             <w:r>
               <w:rPr>
@@ -3154,9 +2906,6 @@
           <w:p>
             <w:pPr>
               <w:spacing w:after="40"/>
-              <w:rPr>
-                <w:rFonts w:hint="eastAsia"/>
-              </w:rPr>
             </w:pPr>
             <w:r>
               <w:rPr>
@@ -3180,9 +2929,6 @@
           <w:p>
             <w:pPr>
               <w:spacing w:after="40" w:line="276" w:lineRule="auto"/>
-              <w:rPr>
-                <w:rFonts w:hint="eastAsia"/>
-              </w:rPr>
             </w:pPr>
             <w:r>
               <w:rPr>
@@ -3199,9 +2945,6 @@
           <w:p>
             <w:pPr>
               <w:spacing w:after="40" w:line="276" w:lineRule="auto"/>
-              <w:rPr>
-                <w:rFonts w:hint="eastAsia"/>
-              </w:rPr>
             </w:pPr>
             <w:r>
               <w:rPr>
@@ -3223,9 +2966,6 @@
           <w:p>
             <w:pPr>
               <w:spacing w:after="40" w:line="276" w:lineRule="auto"/>
-              <w:rPr>
-                <w:rFonts w:hint="eastAsia"/>
-              </w:rPr>
             </w:pPr>
             <w:r>
               <w:rPr>
@@ -3242,21 +2982,12 @@
           <w:p>
             <w:pPr>
               <w:spacing w:after="40" w:line="276" w:lineRule="auto"/>
-              <w:rPr>
-                <w:rFonts w:hint="eastAsia"/>
-              </w:rPr>
             </w:pPr>
             <w:r>
               <w:rPr>
                 <w:sz w:val="19"/>
               </w:rPr>
-              <w:t xml:space="preserve">Returns a </w:t>
-            </w:r>
-            <w:r>
-              <w:rPr>
-                <w:sz w:val="19"/>
-              </w:rPr>
-              <w:t>friendly “try again” with the support number.</w:t>
+              <w:t>Returns a friendly “try again” with the support number.</w:t>
             </w:r>
           </w:p>
         </w:tc>
@@ -3272,9 +3003,6 @@
           <w:p>
             <w:pPr>
               <w:spacing w:after="40" w:line="276" w:lineRule="auto"/>
-              <w:rPr>
-                <w:rFonts w:hint="eastAsia"/>
-              </w:rPr>
             </w:pPr>
             <w:r>
               <w:rPr>
@@ -3291,9 +3019,6 @@
           <w:p>
             <w:pPr>
               <w:spacing w:after="40" w:line="276" w:lineRule="auto"/>
-              <w:rPr>
-                <w:rFonts w:hint="eastAsia"/>
-              </w:rPr>
             </w:pPr>
             <w:r>
               <w:rPr>
@@ -3315,9 +3040,6 @@
           <w:p>
             <w:pPr>
               <w:spacing w:after="40" w:line="276" w:lineRule="auto"/>
-              <w:rPr>
-                <w:rFonts w:hint="eastAsia"/>
-              </w:rPr>
             </w:pPr>
             <w:r>
               <w:rPr>
@@ -3334,9 +3056,6 @@
           <w:p>
             <w:pPr>
               <w:spacing w:after="40" w:line="276" w:lineRule="auto"/>
-              <w:rPr>
-                <w:rFonts w:hint="eastAsia"/>
-              </w:rPr>
             </w:pPr>
             <w:r>
               <w:rPr>
@@ -3358,9 +3077,6 @@
           <w:p>
             <w:pPr>
               <w:spacing w:after="40" w:line="276" w:lineRule="auto"/>
-              <w:rPr>
-                <w:rFonts w:hint="eastAsia"/>
-              </w:rPr>
             </w:pPr>
             <w:r>
               <w:rPr>
@@ -3377,21 +3093,12 @@
           <w:p>
             <w:pPr>
               <w:spacing w:after="40" w:line="276" w:lineRule="auto"/>
-              <w:rPr>
-                <w:rFonts w:hint="eastAsia"/>
-              </w:rPr>
             </w:pPr>
             <w:r>
               <w:rPr>
                 <w:sz w:val="19"/>
               </w:rPr>
-              <w:t xml:space="preserve">Returns a plain-text “no products found” reply; type </w:t>
-            </w:r>
-            <w:r>
-              <w:rPr>
-                <w:sz w:val="19"/>
-              </w:rPr>
-              <w:t>stays “text”.</w:t>
+              <w:t>Returns a plain-text “no products found” reply; type stays “text”.</w:t>
             </w:r>
           </w:p>
         </w:tc>
@@ -3407,9 +3114,6 @@
           <w:p>
             <w:pPr>
               <w:spacing w:after="40" w:line="276" w:lineRule="auto"/>
-              <w:rPr>
-                <w:rFonts w:hint="eastAsia"/>
-              </w:rPr>
             </w:pPr>
             <w:r>
               <w:rPr>
@@ -3426,9 +3130,6 @@
           <w:p>
             <w:pPr>
               <w:spacing w:after="40" w:line="276" w:lineRule="auto"/>
-              <w:rPr>
-                <w:rFonts w:hint="eastAsia"/>
-              </w:rPr>
             </w:pPr>
             <w:r>
               <w:rPr>
@@ -3443,9 +3144,6 @@
     <w:p>
       <w:pPr>
         <w:spacing w:after="80"/>
-        <w:rPr>
-          <w:rFonts w:hint="eastAsia"/>
-        </w:rPr>
       </w:pPr>
     </w:p>
     <w:p>
@@ -3462,9 +3160,6 @@
       <w:pPr>
         <w:pStyle w:val="ListBullet"/>
         <w:spacing w:after="60" w:line="288" w:lineRule="auto"/>
-        <w:rPr>
-          <w:rFonts w:hint="eastAsia"/>
-        </w:rPr>
       </w:pPr>
       <w:r>
         <w:t>run_chat holds no cross-request state. Each run gets its own StoreDeps object; nothing leaks between conversations or users.</w:t>
@@ -3474,9 +3169,6 @@
       <w:pPr>
         <w:pStyle w:val="ListBullet"/>
         <w:spacing w:after="60" w:line="288" w:lineRule="auto"/>
-        <w:rPr>
-          <w:rFonts w:hint="eastAsia"/>
-        </w:rPr>
       </w:pPr>
       <w:r>
         <w:t>The MongoDB client connects lazily and the account indexes are created once at startup, so a cold start does no avoidable work.</w:t>
@@ -3486,9 +3178,6 @@
       <w:pPr>
         <w:pStyle w:val="ListBullet"/>
         <w:spacing w:after="60" w:line="288" w:lineRule="auto"/>
-        <w:rPr>
-          <w:rFonts w:hint="eastAsia"/>
-        </w:rPr>
       </w:pPr>
       <w:r>
         <w:lastRenderedPageBreak/>
@@ -3509,9 +3198,6 @@
       <w:pPr>
         <w:pStyle w:val="ListBullet"/>
         <w:spacing w:after="60" w:line="288" w:lineRule="auto"/>
-        <w:rPr>
-          <w:rFonts w:hint="eastAsia"/>
-        </w:rPr>
       </w:pPr>
       <w:r>
         <w:t>68 tests, fully offline: the database is an in-memory fake and every LLM call is mocked. They run in a few seconds, cost nothing, and touch no network.</w:t>
@@ -3521,30 +3207,18 @@
       <w:pPr>
         <w:pStyle w:val="ListBullet"/>
         <w:spacing w:after="60" w:line="288" w:lineRule="auto"/>
-        <w:rPr>
-          <w:rFonts w:hint="eastAsia"/>
-        </w:rPr>
       </w:pPr>
       <w:r>
-        <w:t xml:space="preserve">The suite covers the whole </w:t>
-      </w:r>
-      <w:r>
-        <w:t>pipeline — guardrail blocking, both fail-open paths, product vs. text responses, the agent-error fallback, and the search_products tool in isolation.</w:t>
+        <w:t>The suite covers the whole pipeline — guardrail blocking, both fail-open paths, product vs. text responses, the agent-error fallback, and the search_products tool in isolation.</w:t>
       </w:r>
     </w:p>
     <w:p>
       <w:pPr>
         <w:pStyle w:val="ListBullet"/>
         <w:spacing w:after="60" w:line="288" w:lineRule="auto"/>
-        <w:rPr>
-          <w:rFonts w:hint="eastAsia"/>
-        </w:rPr>
       </w:pPr>
       <w:r>
-        <w:t xml:space="preserve">CI runs the suite on every push. Nothing deploys unless it is green. A pre-push git hook runs the same </w:t>
-      </w:r>
-      <w:r>
-        <w:t>check locally.</w:t>
+        <w:t>CI runs the suite on every push. Nothing deploys unless it is green. A pre-push git hook runs the same check locally.</w:t>
       </w:r>
     </w:p>
     <w:p>
@@ -3558,11 +3232,6 @@
       <w:bookmarkEnd w:id="16"/>
     </w:p>
     <w:p>
-      <w:pPr>
-        <w:rPr>
-          <w:rFonts w:hint="eastAsia"/>
-        </w:rPr>
-      </w:pPr>
       <w:r>
         <w:t>This section is about how the assistant becomes part of your system — not about how your system is hosted, which is unchanged.</w:t>
       </w:r>
@@ -3581,9 +3250,6 @@
       <w:pPr>
         <w:pStyle w:val="ListBullet"/>
         <w:spacing w:after="60" w:line="288" w:lineRule="auto"/>
-        <w:rPr>
-          <w:rFonts w:hint="eastAsia"/>
-        </w:rPr>
       </w:pPr>
       <w:r>
         <w:rPr>
@@ -3599,9 +3265,6 @@
       <w:pPr>
         <w:pStyle w:val="ListBullet"/>
         <w:spacing w:after="60" w:line="288" w:lineRule="auto"/>
-        <w:rPr>
-          <w:rFonts w:hint="eastAsia"/>
-        </w:rPr>
       </w:pPr>
       <w:r>
         <w:rPr>
@@ -3617,9 +3280,6 @@
       <w:pPr>
         <w:pStyle w:val="ListBullet"/>
         <w:spacing w:after="60" w:line="288" w:lineRule="auto"/>
-        <w:rPr>
-          <w:rFonts w:hint="eastAsia"/>
-        </w:rPr>
       </w:pPr>
       <w:r>
         <w:rPr>
@@ -3635,9 +3295,6 @@
       <w:pPr>
         <w:pStyle w:val="ListBullet"/>
         <w:spacing w:after="60" w:line="288" w:lineRule="auto"/>
-        <w:rPr>
-          <w:rFonts w:hint="eastAsia"/>
-        </w:rPr>
       </w:pPr>
       <w:r>
         <w:rPr>
@@ -3650,11 +3307,6 @@
       </w:r>
     </w:p>
     <w:p>
-      <w:pPr>
-        <w:rPr>
-          <w:rFonts w:hint="eastAsia"/>
-        </w:rPr>
-      </w:pPr>
       <w:r>
         <w:t>We prove this is a clean drop-in before integration begins: the same chatbot/ package is built and demonstrated as a standalone proof of concept, then moved into the store unchanged. The only difference between the two is a single configuration flag that turns evaluation on.</w:t>
       </w:r>
@@ -3701,9 +3353,6 @@
           <w:p>
             <w:pPr>
               <w:spacing w:after="40"/>
-              <w:rPr>
-                <w:rFonts w:hint="eastAsia"/>
-              </w:rPr>
             </w:pPr>
             <w:r>
               <w:rPr>
@@ -3723,9 +3372,6 @@
           <w:p>
             <w:pPr>
               <w:spacing w:after="40"/>
-              <w:rPr>
-                <w:rFonts w:hint="eastAsia"/>
-              </w:rPr>
             </w:pPr>
             <w:r>
               <w:rPr>
@@ -3745,9 +3391,6 @@
           <w:p>
             <w:pPr>
               <w:spacing w:after="40"/>
-              <w:rPr>
-                <w:rFonts w:hint="eastAsia"/>
-              </w:rPr>
             </w:pPr>
             <w:r>
               <w:rPr>
@@ -3771,9 +3414,6 @@
           <w:p>
             <w:pPr>
               <w:spacing w:after="40" w:line="276" w:lineRule="auto"/>
-              <w:rPr>
-                <w:rFonts w:hint="eastAsia"/>
-              </w:rPr>
             </w:pPr>
             <w:r>
               <w:rPr>
@@ -3790,9 +3430,6 @@
           <w:p>
             <w:pPr>
               <w:spacing w:after="40" w:line="276" w:lineRule="auto"/>
-              <w:rPr>
-                <w:rFonts w:hint="eastAsia"/>
-              </w:rPr>
             </w:pPr>
             <w:r>
               <w:rPr>
@@ -3809,9 +3446,6 @@
           <w:p>
             <w:pPr>
               <w:spacing w:after="40" w:line="276" w:lineRule="auto"/>
-              <w:rPr>
-                <w:rFonts w:hint="eastAsia"/>
-              </w:rPr>
             </w:pPr>
             <w:r>
               <w:rPr>
@@ -3833,9 +3467,6 @@
           <w:p>
             <w:pPr>
               <w:spacing w:after="40" w:line="276" w:lineRule="auto"/>
-              <w:rPr>
-                <w:rFonts w:hint="eastAsia"/>
-              </w:rPr>
             </w:pPr>
             <w:r>
               <w:rPr>
@@ -3852,9 +3483,6 @@
           <w:p>
             <w:pPr>
               <w:spacing w:after="40" w:line="276" w:lineRule="auto"/>
-              <w:rPr>
-                <w:rFonts w:hint="eastAsia"/>
-              </w:rPr>
             </w:pPr>
             <w:r>
               <w:rPr>
@@ -3871,9 +3499,6 @@
           <w:p>
             <w:pPr>
               <w:spacing w:after="40" w:line="276" w:lineRule="auto"/>
-              <w:rPr>
-                <w:rFonts w:hint="eastAsia"/>
-              </w:rPr>
             </w:pPr>
             <w:r>
               <w:rPr>
@@ -3895,9 +3520,6 @@
           <w:p>
             <w:pPr>
               <w:spacing w:after="40" w:line="276" w:lineRule="auto"/>
-              <w:rPr>
-                <w:rFonts w:hint="eastAsia"/>
-              </w:rPr>
             </w:pPr>
             <w:r>
               <w:rPr>
@@ -3914,9 +3536,6 @@
           <w:p>
             <w:pPr>
               <w:spacing w:after="40" w:line="276" w:lineRule="auto"/>
-              <w:rPr>
-                <w:rFonts w:hint="eastAsia"/>
-              </w:rPr>
             </w:pPr>
             <w:r>
               <w:rPr>
@@ -3933,21 +3552,12 @@
           <w:p>
             <w:pPr>
               <w:spacing w:after="40" w:line="276" w:lineRule="auto"/>
-              <w:rPr>
-                <w:rFonts w:hint="eastAsia"/>
-              </w:rPr>
             </w:pPr>
             <w:r>
               <w:rPr>
                 <w:sz w:val="19"/>
               </w:rPr>
-              <w:t xml:space="preserve">Route model calls </w:t>
-            </w:r>
-            <w:r>
-              <w:rPr>
-                <w:sz w:val="19"/>
-              </w:rPr>
-              <w:t>through the Portkey gateway.</w:t>
+              <w:t>Route model calls through the Portkey gateway.</w:t>
             </w:r>
           </w:p>
         </w:tc>
@@ -3963,9 +3573,6 @@
           <w:p>
             <w:pPr>
               <w:spacing w:after="40" w:line="276" w:lineRule="auto"/>
-              <w:rPr>
-                <w:rFonts w:hint="eastAsia"/>
-              </w:rPr>
             </w:pPr>
             <w:r>
               <w:rPr>
@@ -3982,9 +3589,6 @@
           <w:p>
             <w:pPr>
               <w:spacing w:after="40" w:line="276" w:lineRule="auto"/>
-              <w:rPr>
-                <w:rFonts w:hint="eastAsia"/>
-              </w:rPr>
             </w:pPr>
             <w:r>
               <w:rPr>
@@ -4001,9 +3605,6 @@
           <w:p>
             <w:pPr>
               <w:spacing w:after="40" w:line="276" w:lineRule="auto"/>
-              <w:rPr>
-                <w:rFonts w:hint="eastAsia"/>
-              </w:rPr>
             </w:pPr>
             <w:r>
               <w:rPr>
@@ -4025,9 +3626,6 @@
           <w:p>
             <w:pPr>
               <w:spacing w:after="40" w:line="276" w:lineRule="auto"/>
-              <w:rPr>
-                <w:rFonts w:hint="eastAsia"/>
-              </w:rPr>
             </w:pPr>
             <w:r>
               <w:rPr>
@@ -4044,9 +3642,6 @@
           <w:p>
             <w:pPr>
               <w:spacing w:after="40" w:line="276" w:lineRule="auto"/>
-              <w:rPr>
-                <w:rFonts w:hint="eastAsia"/>
-              </w:rPr>
             </w:pPr>
             <w:r>
               <w:rPr>
@@ -4063,9 +3658,6 @@
           <w:p>
             <w:pPr>
               <w:spacing w:after="40" w:line="276" w:lineRule="auto"/>
-              <w:rPr>
-                <w:rFonts w:hint="eastAsia"/>
-              </w:rPr>
             </w:pPr>
             <w:r>
               <w:rPr>
@@ -4087,9 +3679,6 @@
           <w:p>
             <w:pPr>
               <w:spacing w:after="40" w:line="276" w:lineRule="auto"/>
-              <w:rPr>
-                <w:rFonts w:hint="eastAsia"/>
-              </w:rPr>
             </w:pPr>
             <w:r>
               <w:rPr>
@@ -4106,9 +3695,6 @@
           <w:p>
             <w:pPr>
               <w:spacing w:after="40" w:line="276" w:lineRule="auto"/>
-              <w:rPr>
-                <w:rFonts w:hint="eastAsia"/>
-              </w:rPr>
             </w:pPr>
             <w:r>
               <w:rPr>
@@ -4125,9 +3711,6 @@
           <w:p>
             <w:pPr>
               <w:spacing w:after="40" w:line="276" w:lineRule="auto"/>
-              <w:rPr>
-                <w:rFonts w:hint="eastAsia"/>
-              </w:rPr>
             </w:pPr>
             <w:r>
               <w:rPr>
@@ -4149,9 +3732,6 @@
           <w:p>
             <w:pPr>
               <w:spacing w:after="40" w:line="276" w:lineRule="auto"/>
-              <w:rPr>
-                <w:rFonts w:hint="eastAsia"/>
-              </w:rPr>
             </w:pPr>
             <w:r>
               <w:rPr>
@@ -4169,9 +3749,6 @@
           <w:p>
             <w:pPr>
               <w:spacing w:after="40" w:line="276" w:lineRule="auto"/>
-              <w:rPr>
-                <w:rFonts w:hint="eastAsia"/>
-              </w:rPr>
             </w:pPr>
             <w:r>
               <w:rPr>
@@ -4188,9 +3765,6 @@
           <w:p>
             <w:pPr>
               <w:spacing w:after="40" w:line="276" w:lineRule="auto"/>
-              <w:rPr>
-                <w:rFonts w:hint="eastAsia"/>
-              </w:rPr>
             </w:pPr>
             <w:r>
               <w:rPr>
@@ -4205,17 +3779,9 @@
     <w:p>
       <w:pPr>
         <w:spacing w:after="80"/>
-        <w:rPr>
-          <w:rFonts w:hint="eastAsia"/>
-        </w:rPr>
       </w:pPr>
     </w:p>
     <w:p>
-      <w:pPr>
-        <w:rPr>
-          <w:rFonts w:hint="eastAsia"/>
-        </w:rPr>
-      </w:pPr>
       <w:r>
         <w:t>All of it is read in exactly one place — a single typed settings object — so there is one file to review for what the service touches.</w:t>
       </w:r>
@@ -4231,11 +3797,6 @@
       <w:bookmarkEnd w:id="19"/>
     </w:p>
     <w:p>
-      <w:pPr>
-        <w:rPr>
-          <w:rFonts w:hint="eastAsia"/>
-        </w:rPr>
-      </w:pPr>
       <w:r>
         <w:t>The work is delivered in three stages, each ending in something you can run and judge:</w:t>
       </w:r>
@@ -4272,9 +3833,6 @@
           <w:p>
             <w:pPr>
               <w:spacing w:after="40"/>
-              <w:rPr>
-                <w:rFonts w:hint="eastAsia"/>
-              </w:rPr>
             </w:pPr>
             <w:r>
               <w:rPr>
@@ -4294,9 +3852,6 @@
           <w:p>
             <w:pPr>
               <w:spacing w:after="40"/>
-              <w:rPr>
-                <w:rFonts w:hint="eastAsia"/>
-              </w:rPr>
             </w:pPr>
             <w:r>
               <w:rPr>
@@ -4316,9 +3871,6 @@
           <w:p>
             <w:pPr>
               <w:spacing w:after="40"/>
-              <w:rPr>
-                <w:rFonts w:hint="eastAsia"/>
-              </w:rPr>
             </w:pPr>
             <w:r>
               <w:rPr>
@@ -4342,9 +3894,6 @@
           <w:p>
             <w:pPr>
               <w:spacing w:after="40" w:line="276" w:lineRule="auto"/>
-              <w:rPr>
-                <w:rFonts w:hint="eastAsia"/>
-              </w:rPr>
             </w:pPr>
             <w:r>
               <w:rPr>
@@ -4361,9 +3910,6 @@
           <w:p>
             <w:pPr>
               <w:spacing w:after="40" w:line="276" w:lineRule="auto"/>
-              <w:rPr>
-                <w:rFonts w:hint="eastAsia"/>
-              </w:rPr>
             </w:pPr>
             <w:r>
               <w:rPr>
@@ -4380,21 +3926,12 @@
           <w:p>
             <w:pPr>
               <w:spacing w:after="40" w:line="276" w:lineRule="auto"/>
-              <w:rPr>
-                <w:rFonts w:hint="eastAsia"/>
-              </w:rPr>
             </w:pPr>
             <w:r>
               <w:rPr>
                 <w:sz w:val="19"/>
               </w:rPr>
-              <w:t xml:space="preserve">We work inside the running store, learn the catalog and the data, and agree the success </w:t>
-            </w:r>
-            <w:r>
-              <w:rPr>
-                <w:sz w:val="19"/>
-              </w:rPr>
-              <w:t>criteria. Deliverable: this document, confirmed against reality.</w:t>
+              <w:t>We work inside the running store, learn the catalog and the data, and agree the success criteria. Deliverable: this document, confirmed against reality.</w:t>
             </w:r>
           </w:p>
         </w:tc>
@@ -4410,9 +3947,6 @@
           <w:p>
             <w:pPr>
               <w:spacing w:after="40" w:line="276" w:lineRule="auto"/>
-              <w:rPr>
-                <w:rFonts w:hint="eastAsia"/>
-              </w:rPr>
             </w:pPr>
             <w:r>
               <w:rPr>
@@ -4429,9 +3963,6 @@
           <w:p>
             <w:pPr>
               <w:spacing w:after="40" w:line="276" w:lineRule="auto"/>
-              <w:rPr>
-                <w:rFonts w:hint="eastAsia"/>
-              </w:rPr>
             </w:pPr>
             <w:r>
               <w:rPr>
@@ -4448,9 +3979,6 @@
           <w:p>
             <w:pPr>
               <w:spacing w:after="40" w:line="276" w:lineRule="auto"/>
-              <w:rPr>
-                <w:rFonts w:hint="eastAsia"/>
-              </w:rPr>
             </w:pPr>
             <w:r>
               <w:rPr>
@@ -4472,9 +4000,6 @@
           <w:p>
             <w:pPr>
               <w:spacing w:after="40" w:line="276" w:lineRule="auto"/>
-              <w:rPr>
-                <w:rFonts w:hint="eastAsia"/>
-              </w:rPr>
             </w:pPr>
             <w:r>
               <w:rPr>
@@ -4491,9 +4016,6 @@
           <w:p>
             <w:pPr>
               <w:spacing w:after="40" w:line="276" w:lineRule="auto"/>
-              <w:rPr>
-                <w:rFonts w:hint="eastAsia"/>
-              </w:rPr>
             </w:pPr>
             <w:r>
               <w:rPr>
@@ -4510,9 +4032,6 @@
           <w:p>
             <w:pPr>
               <w:spacing w:after="40" w:line="276" w:lineRule="auto"/>
-              <w:rPr>
-                <w:rFonts w:hint="eastAsia"/>
-              </w:rPr>
             </w:pPr>
             <w:r>
               <w:rPr>
@@ -4527,30 +4046,14 @@
     <w:p>
       <w:pPr>
         <w:spacing w:after="80"/>
-        <w:rPr>
-          <w:rFonts w:hint="eastAsia"/>
-        </w:rPr>
       </w:pPr>
     </w:p>
     <w:p>
-      <w:pPr>
-        <w:rPr>
-          <w:rFonts w:hint="eastAsia"/>
-        </w:rPr>
-      </w:pPr>
       <w:r>
-        <w:t xml:space="preserve">Each stage lives on its own branch, so the plain store, the isolated proof of </w:t>
-      </w:r>
-      <w:r>
-        <w:t>concept, and the integrated result stay separately reviewable. The assistant's core code is byte-for-byte identical between the proof of concept and the integrated version.</w:t>
+        <w:t>Each stage lives on its own branch, so the plain store, the isolated proof of concept, and the integrated result stay separately reviewable. The assistant's core code is byte-for-byte identical between the proof of concept and the integrated version.</w:t>
       </w:r>
     </w:p>
     <w:p>
-      <w:pPr>
-        <w:rPr>
-          <w:rFonts w:hint="eastAsia"/>
-        </w:rPr>
-      </w:pPr>
       <w:r>
         <w:br w:type="page"/>
       </w:r>
@@ -4567,11 +4070,6 @@
       <w:bookmarkEnd w:id="20"/>
     </w:p>
     <w:p>
-      <w:pPr>
-        <w:rPr>
-          <w:rFonts w:hint="eastAsia"/>
-        </w:rPr>
-      </w:pPr>
       <w:r>
         <w:t>The assistant's running cost is almost entirely Groq API usage. Everything else — the database, the store's hosting — already exists and does not change.</w:t>
       </w:r>
@@ -4587,11 +4085,6 @@
       <w:bookmarkEnd w:id="21"/>
     </w:p>
     <w:p>
-      <w:pPr>
-        <w:rPr>
-          <w:rFonts w:hint="eastAsia"/>
-        </w:rPr>
-      </w:pPr>
       <w:r>
         <w:t>A single shopper message triggers up to four model calls: the prompt-injection classifier (tiny), the input policy check, the agent (one or two rounds if it uses the tool), and the output policy check. Realistic token totals:</w:t>
       </w:r>
@@ -4629,9 +4122,6 @@
           <w:p>
             <w:pPr>
               <w:spacing w:after="40"/>
-              <w:rPr>
-                <w:rFonts w:hint="eastAsia"/>
-              </w:rPr>
             </w:pPr>
             <w:r>
               <w:rPr>
@@ -4651,9 +4141,6 @@
           <w:p>
             <w:pPr>
               <w:spacing w:after="40"/>
-              <w:rPr>
-                <w:rFonts w:hint="eastAsia"/>
-              </w:rPr>
             </w:pPr>
             <w:r>
               <w:rPr>
@@ -4673,9 +4160,6 @@
           <w:p>
             <w:pPr>
               <w:spacing w:after="40"/>
-              <w:rPr>
-                <w:rFonts w:hint="eastAsia"/>
-              </w:rPr>
             </w:pPr>
             <w:r>
               <w:rPr>
@@ -4695,9 +4179,6 @@
           <w:p>
             <w:pPr>
               <w:spacing w:after="40"/>
-              <w:rPr>
-                <w:rFonts w:hint="eastAsia"/>
-              </w:rPr>
             </w:pPr>
             <w:r>
               <w:rPr>
@@ -4721,9 +4202,6 @@
           <w:p>
             <w:pPr>
               <w:spacing w:after="40" w:line="276" w:lineRule="auto"/>
-              <w:rPr>
-                <w:rFonts w:hint="eastAsia"/>
-              </w:rPr>
             </w:pPr>
             <w:r>
               <w:rPr>
@@ -4740,9 +4218,6 @@
           <w:p>
             <w:pPr>
               <w:spacing w:after="40" w:line="276" w:lineRule="auto"/>
-              <w:rPr>
-                <w:rFonts w:hint="eastAsia"/>
-              </w:rPr>
             </w:pPr>
             <w:r>
               <w:rPr>
@@ -4759,9 +4234,6 @@
           <w:p>
             <w:pPr>
               <w:spacing w:after="40" w:line="276" w:lineRule="auto"/>
-              <w:rPr>
-                <w:rFonts w:hint="eastAsia"/>
-              </w:rPr>
             </w:pPr>
             <w:r>
               <w:rPr>
@@ -4778,9 +4250,6 @@
           <w:p>
             <w:pPr>
               <w:spacing w:after="40" w:line="276" w:lineRule="auto"/>
-              <w:rPr>
-                <w:rFonts w:hint="eastAsia"/>
-              </w:rPr>
             </w:pPr>
             <w:r>
               <w:rPr>
@@ -4802,9 +4271,6 @@
           <w:p>
             <w:pPr>
               <w:spacing w:after="40" w:line="276" w:lineRule="auto"/>
-              <w:rPr>
-                <w:rFonts w:hint="eastAsia"/>
-              </w:rPr>
             </w:pPr>
             <w:r>
               <w:rPr>
@@ -4821,9 +4287,6 @@
           <w:p>
             <w:pPr>
               <w:spacing w:after="40" w:line="276" w:lineRule="auto"/>
-              <w:rPr>
-                <w:rFonts w:hint="eastAsia"/>
-              </w:rPr>
             </w:pPr>
             <w:r>
               <w:rPr>
@@ -4840,9 +4303,6 @@
           <w:p>
             <w:pPr>
               <w:spacing w:after="40" w:line="276" w:lineRule="auto"/>
-              <w:rPr>
-                <w:rFonts w:hint="eastAsia"/>
-              </w:rPr>
             </w:pPr>
             <w:r>
               <w:rPr>
@@ -4859,9 +4319,6 @@
           <w:p>
             <w:pPr>
               <w:spacing w:after="40" w:line="276" w:lineRule="auto"/>
-              <w:rPr>
-                <w:rFonts w:hint="eastAsia"/>
-              </w:rPr>
             </w:pPr>
             <w:r>
               <w:rPr>
@@ -4883,21 +4340,12 @@
           <w:p>
             <w:pPr>
               <w:spacing w:after="40" w:line="276" w:lineRule="auto"/>
-              <w:rPr>
-                <w:rFonts w:hint="eastAsia"/>
-              </w:rPr>
             </w:pPr>
             <w:r>
               <w:rPr>
                 <w:sz w:val="19"/>
               </w:rPr>
-              <w:t xml:space="preserve">Agent (with </w:t>
-            </w:r>
-            <w:r>
-              <w:rPr>
-                <w:sz w:val="19"/>
-              </w:rPr>
-              <w:t>tool)</w:t>
+              <w:t>Agent (with tool)</w:t>
             </w:r>
           </w:p>
         </w:tc>
@@ -4908,9 +4356,6 @@
           <w:p>
             <w:pPr>
               <w:spacing w:after="40" w:line="276" w:lineRule="auto"/>
-              <w:rPr>
-                <w:rFonts w:hint="eastAsia"/>
-              </w:rPr>
             </w:pPr>
             <w:r>
               <w:rPr>
@@ -4927,9 +4372,6 @@
           <w:p>
             <w:pPr>
               <w:spacing w:after="40" w:line="276" w:lineRule="auto"/>
-              <w:rPr>
-                <w:rFonts w:hint="eastAsia"/>
-              </w:rPr>
             </w:pPr>
             <w:r>
               <w:rPr>
@@ -4946,9 +4388,6 @@
           <w:p>
             <w:pPr>
               <w:spacing w:after="40" w:line="276" w:lineRule="auto"/>
-              <w:rPr>
-                <w:rFonts w:hint="eastAsia"/>
-              </w:rPr>
             </w:pPr>
             <w:r>
               <w:rPr>
@@ -4970,9 +4409,6 @@
           <w:p>
             <w:pPr>
               <w:spacing w:after="40" w:line="276" w:lineRule="auto"/>
-              <w:rPr>
-                <w:rFonts w:hint="eastAsia"/>
-              </w:rPr>
             </w:pPr>
             <w:r>
               <w:rPr>
@@ -4989,9 +4425,6 @@
           <w:p>
             <w:pPr>
               <w:spacing w:after="40" w:line="276" w:lineRule="auto"/>
-              <w:rPr>
-                <w:rFonts w:hint="eastAsia"/>
-              </w:rPr>
             </w:pPr>
             <w:r>
               <w:rPr>
@@ -5008,9 +4441,6 @@
           <w:p>
             <w:pPr>
               <w:spacing w:after="40" w:line="276" w:lineRule="auto"/>
-              <w:rPr>
-                <w:rFonts w:hint="eastAsia"/>
-              </w:rPr>
             </w:pPr>
             <w:r>
               <w:rPr>
@@ -5027,9 +4457,6 @@
           <w:p>
             <w:pPr>
               <w:spacing w:after="40" w:line="276" w:lineRule="auto"/>
-              <w:rPr>
-                <w:rFonts w:hint="eastAsia"/>
-              </w:rPr>
             </w:pPr>
             <w:r>
               <w:rPr>
@@ -5051,9 +4478,6 @@
           <w:p>
             <w:pPr>
               <w:spacing w:after="40" w:line="276" w:lineRule="auto"/>
-              <w:rPr>
-                <w:rFonts w:hint="eastAsia"/>
-              </w:rPr>
             </w:pPr>
             <w:r>
               <w:rPr>
@@ -5070,9 +4494,6 @@
           <w:p>
             <w:pPr>
               <w:spacing w:after="40" w:line="276" w:lineRule="auto"/>
-              <w:rPr>
-                <w:rFonts w:hint="eastAsia"/>
-              </w:rPr>
             </w:pPr>
           </w:p>
         </w:tc>
@@ -5083,9 +4504,6 @@
           <w:p>
             <w:pPr>
               <w:spacing w:after="40" w:line="276" w:lineRule="auto"/>
-              <w:rPr>
-                <w:rFonts w:hint="eastAsia"/>
-              </w:rPr>
             </w:pPr>
           </w:p>
         </w:tc>
@@ -5096,9 +4514,6 @@
           <w:p>
             <w:pPr>
               <w:spacing w:after="40" w:line="276" w:lineRule="auto"/>
-              <w:rPr>
-                <w:rFonts w:hint="eastAsia"/>
-              </w:rPr>
             </w:pPr>
             <w:r>
               <w:rPr>
@@ -5113,9 +4528,6 @@
     <w:p>
       <w:pPr>
         <w:spacing w:after="80"/>
-        <w:rPr>
-          <w:rFonts w:hint="eastAsia"/>
-        </w:rPr>
       </w:pPr>
     </w:p>
     <w:p>
@@ -5162,9 +4574,6 @@
           <w:p>
             <w:pPr>
               <w:spacing w:after="40"/>
-              <w:rPr>
-                <w:rFonts w:hint="eastAsia"/>
-              </w:rPr>
             </w:pPr>
             <w:r>
               <w:rPr>
@@ -5184,9 +4593,6 @@
           <w:p>
             <w:pPr>
               <w:spacing w:after="40"/>
-              <w:rPr>
-                <w:rFonts w:hint="eastAsia"/>
-              </w:rPr>
             </w:pPr>
             <w:r>
               <w:rPr>
@@ -5206,9 +4612,6 @@
           <w:p>
             <w:pPr>
               <w:spacing w:after="40"/>
-              <w:rPr>
-                <w:rFonts w:hint="eastAsia"/>
-              </w:rPr>
             </w:pPr>
             <w:r>
               <w:rPr>
@@ -5228,9 +4631,6 @@
           <w:p>
             <w:pPr>
               <w:spacing w:after="40"/>
-              <w:rPr>
-                <w:rFonts w:hint="eastAsia"/>
-              </w:rPr>
             </w:pPr>
             <w:r>
               <w:rPr>
@@ -5250,9 +4650,6 @@
           <w:p>
             <w:pPr>
               <w:spacing w:after="40"/>
-              <w:rPr>
-                <w:rFonts w:hint="eastAsia"/>
-              </w:rPr>
             </w:pPr>
             <w:r>
               <w:rPr>
@@ -5276,9 +4673,6 @@
           <w:p>
             <w:pPr>
               <w:spacing w:after="40" w:line="276" w:lineRule="auto"/>
-              <w:rPr>
-                <w:rFonts w:hint="eastAsia"/>
-              </w:rPr>
             </w:pPr>
             <w:r>
               <w:rPr>
@@ -5295,9 +4689,6 @@
           <w:p>
             <w:pPr>
               <w:spacing w:after="40" w:line="276" w:lineRule="auto"/>
-              <w:rPr>
-                <w:rFonts w:hint="eastAsia"/>
-              </w:rPr>
             </w:pPr>
             <w:r>
               <w:rPr>
@@ -5314,9 +4705,6 @@
           <w:p>
             <w:pPr>
               <w:spacing w:after="40" w:line="276" w:lineRule="auto"/>
-              <w:rPr>
-                <w:rFonts w:hint="eastAsia"/>
-              </w:rPr>
             </w:pPr>
             <w:r>
               <w:rPr>
@@ -5333,21 +4721,12 @@
           <w:p>
             <w:pPr>
               <w:spacing w:after="40" w:line="276" w:lineRule="auto"/>
-              <w:rPr>
-                <w:rFonts w:hint="eastAsia"/>
-              </w:rPr>
             </w:pPr>
             <w:r>
               <w:rPr>
                 <w:sz w:val="19"/>
               </w:rPr>
-              <w:t xml:space="preserve">$0  (free </w:t>
-            </w:r>
-            <w:r>
-              <w:rPr>
-                <w:sz w:val="19"/>
-              </w:rPr>
-              <w:t>tier)</w:t>
+              <w:t>$0  (free tier)</w:t>
             </w:r>
           </w:p>
         </w:tc>
@@ -5358,9 +4737,6 @@
           <w:p>
             <w:pPr>
               <w:spacing w:after="40" w:line="276" w:lineRule="auto"/>
-              <w:rPr>
-                <w:rFonts w:hint="eastAsia"/>
-              </w:rPr>
             </w:pPr>
             <w:r>
               <w:rPr>
@@ -5382,9 +4758,6 @@
           <w:p>
             <w:pPr>
               <w:spacing w:after="40" w:line="276" w:lineRule="auto"/>
-              <w:rPr>
-                <w:rFonts w:hint="eastAsia"/>
-              </w:rPr>
             </w:pPr>
             <w:r>
               <w:rPr>
@@ -5401,9 +4774,6 @@
           <w:p>
             <w:pPr>
               <w:spacing w:after="40" w:line="276" w:lineRule="auto"/>
-              <w:rPr>
-                <w:rFonts w:hint="eastAsia"/>
-              </w:rPr>
             </w:pPr>
             <w:r>
               <w:rPr>
@@ -5420,9 +4790,6 @@
           <w:p>
             <w:pPr>
               <w:spacing w:after="40" w:line="276" w:lineRule="auto"/>
-              <w:rPr>
-                <w:rFonts w:hint="eastAsia"/>
-              </w:rPr>
             </w:pPr>
             <w:r>
               <w:rPr>
@@ -5439,9 +4806,6 @@
           <w:p>
             <w:pPr>
               <w:spacing w:after="40" w:line="276" w:lineRule="auto"/>
-              <w:rPr>
-                <w:rFonts w:hint="eastAsia"/>
-              </w:rPr>
             </w:pPr>
             <w:r>
               <w:rPr>
@@ -5458,9 +4822,6 @@
           <w:p>
             <w:pPr>
               <w:spacing w:after="40" w:line="276" w:lineRule="auto"/>
-              <w:rPr>
-                <w:rFonts w:hint="eastAsia"/>
-              </w:rPr>
             </w:pPr>
             <w:r>
               <w:rPr>
@@ -5482,9 +4843,6 @@
           <w:p>
             <w:pPr>
               <w:spacing w:after="40" w:line="276" w:lineRule="auto"/>
-              <w:rPr>
-                <w:rFonts w:hint="eastAsia"/>
-              </w:rPr>
             </w:pPr>
             <w:r>
               <w:rPr>
@@ -5501,9 +4859,6 @@
           <w:p>
             <w:pPr>
               <w:spacing w:after="40" w:line="276" w:lineRule="auto"/>
-              <w:rPr>
-                <w:rFonts w:hint="eastAsia"/>
-              </w:rPr>
             </w:pPr>
             <w:r>
               <w:rPr>
@@ -5520,9 +4875,6 @@
           <w:p>
             <w:pPr>
               <w:spacing w:after="40" w:line="276" w:lineRule="auto"/>
-              <w:rPr>
-                <w:rFonts w:hint="eastAsia"/>
-              </w:rPr>
             </w:pPr>
             <w:r>
               <w:rPr>
@@ -5539,9 +4891,6 @@
           <w:p>
             <w:pPr>
               <w:spacing w:after="40" w:line="276" w:lineRule="auto"/>
-              <w:rPr>
-                <w:rFonts w:hint="eastAsia"/>
-              </w:rPr>
             </w:pPr>
             <w:r>
               <w:rPr>
@@ -5558,9 +4907,6 @@
           <w:p>
             <w:pPr>
               <w:spacing w:after="40" w:line="276" w:lineRule="auto"/>
-              <w:rPr>
-                <w:rFonts w:hint="eastAsia"/>
-              </w:rPr>
             </w:pPr>
             <w:r>
               <w:rPr>
@@ -5582,9 +4928,6 @@
           <w:p>
             <w:pPr>
               <w:spacing w:after="40" w:line="276" w:lineRule="auto"/>
-              <w:rPr>
-                <w:rFonts w:hint="eastAsia"/>
-              </w:rPr>
             </w:pPr>
             <w:r>
               <w:rPr>
@@ -5601,9 +4944,6 @@
           <w:p>
             <w:pPr>
               <w:spacing w:after="40" w:line="276" w:lineRule="auto"/>
-              <w:rPr>
-                <w:rFonts w:hint="eastAsia"/>
-              </w:rPr>
             </w:pPr>
             <w:r>
               <w:rPr>
@@ -5620,9 +4960,6 @@
           <w:p>
             <w:pPr>
               <w:spacing w:after="40" w:line="276" w:lineRule="auto"/>
-              <w:rPr>
-                <w:rFonts w:hint="eastAsia"/>
-              </w:rPr>
             </w:pPr>
             <w:r>
               <w:rPr>
@@ -5639,9 +4976,6 @@
           <w:p>
             <w:pPr>
               <w:spacing w:after="40" w:line="276" w:lineRule="auto"/>
-              <w:rPr>
-                <w:rFonts w:hint="eastAsia"/>
-              </w:rPr>
             </w:pPr>
             <w:r>
               <w:rPr>
@@ -5658,9 +4992,6 @@
           <w:p>
             <w:pPr>
               <w:spacing w:after="40" w:line="276" w:lineRule="auto"/>
-              <w:rPr>
-                <w:rFonts w:hint="eastAsia"/>
-              </w:rPr>
             </w:pPr>
             <w:r>
               <w:rPr>
@@ -5675,33 +5006,21 @@
     <w:p>
       <w:pPr>
         <w:spacing w:after="80"/>
-        <w:rPr>
-          <w:rFonts w:hint="eastAsia"/>
-        </w:rPr>
       </w:pPr>
     </w:p>
     <w:p>
       <w:pPr>
         <w:pStyle w:val="ListBullet"/>
         <w:spacing w:after="60" w:line="288" w:lineRule="auto"/>
-        <w:rPr>
-          <w:rFonts w:hint="eastAsia"/>
-        </w:rPr>
       </w:pPr>
       <w:r>
-        <w:t xml:space="preserve">Figures use approximate public Groq and MongoDB </w:t>
-      </w:r>
-      <w:r>
-        <w:t>rates as of September 2026.</w:t>
+        <w:t>Figures use approximate public Groq and MongoDB rates as of September 2026.</w:t>
       </w:r>
     </w:p>
     <w:p>
       <w:pPr>
         <w:pStyle w:val="ListBullet"/>
         <w:spacing w:after="60" w:line="288" w:lineRule="auto"/>
-        <w:rPr>
-          <w:rFonts w:hint="eastAsia"/>
-        </w:rPr>
       </w:pPr>
       <w:r>
         <w:t>Groq's free tier and per-minute limits cover pilot and early-launch volume outright; the numbers above assume paid, on-demand usage.</w:t>
@@ -5711,9 +5030,6 @@
       <w:pPr>
         <w:pStyle w:val="ListBullet"/>
         <w:spacing w:after="60" w:line="288" w:lineRule="auto"/>
-        <w:rPr>
-          <w:rFonts w:hint="eastAsia"/>
-        </w:rPr>
       </w:pPr>
       <w:r>
         <w:t>Two levers cut this further if needed: prompt caching (50% off repeated input, and the guard policies are identical every call) and the batch API for the offline eval suite (another 50%).</w:t>
@@ -5722,9 +5038,6 @@
     <w:p>
       <w:pPr>
         <w:spacing w:before="40" w:after="240"/>
-        <w:rPr>
-          <w:rFonts w:hint="eastAsia"/>
-        </w:rPr>
       </w:pPr>
       <w:r>
         <w:rPr>
@@ -5746,7 +5059,7 @@
 </file>
 
 <file path=word/numbering.xml><?xml version="1.0" encoding="utf-8"?>
-<w:numbering xmlns:wpc="http://schemas.microsoft.com/office/word/2010/wordprocessingCanvas" xmlns:cx="http://schemas.microsoft.com/office/drawing/2014/chartex" xmlns:cx1="http://schemas.microsoft.com/office/drawing/2015/9/8/chartex" xmlns:cx2="http://schemas.microsoft.com/office/drawing/2015/10/21/chartex" xmlns:cx3="http://schemas.microsoft.com/office/drawing/2016/5/9/chartex" xmlns:cx4="http://schemas.microsoft.com/office/drawing/2016/5/10/chartex" xmlns:cx5="http://schemas.microsoft.com/office/drawing/2016/5/11/chartex" xmlns:cx6="http://schemas.microsoft.com/office/drawing/2016/5/12/chartex" xmlns:cx7="http://schemas.microsoft.com/office/drawing/2016/5/13/chartex" xmlns:cx8="http://schemas.microsoft.com/office/drawing/2016/5/14/chartex" xmlns:mc="http://schemas.openxmlformats.org/markup-compatibility/2006" xmlns:aink="http://schemas.microsoft.com/office/drawing/2016/ink" xmlns:am3d="http://schemas.microsoft.com/office/drawing/2017/model3d" xmlns:o="urn:schemas-microsoft-com:office:office" xmlns:oel="http://schemas.microsoft.com/office/2019/extlst" xmlns:r="http://schemas.openxmlformats.org/officeDocument/2006/relationships" xmlns:m="http://schemas.openxmlformats.org/officeDocument/2006/math" xmlns:v="urn:schemas-microsoft-com:vml" xmlns:wp14="http://schemas.microsoft.com/office/word/2010/wordprocessingDrawing" xmlns:wp="http://schemas.openxmlformats.org/drawingml/2006/wordprocessingDrawing" xmlns:w10="urn:schemas-microsoft-com:office:word" xmlns:w="http://schemas.openxmlformats.org/wordprocessingml/2006/main" xmlns:w14="http://schemas.microsoft.com/office/word/2010/wordml" xmlns:w15="http://schemas.microsoft.com/office/word/2012/wordml" xmlns:w16cex="http://schemas.microsoft.com/office/word/2018/wordml/cex" xmlns:w16cid="http://schemas.microsoft.com/office/word/2016/wordml/cid" xmlns:w16="http://schemas.microsoft.com/office/word/2018/wordml" xmlns:w16sdtdh="http://schemas.microsoft.com/office/word/2020/wordml/sdtdatahash" xmlns:w16se="http://schemas.microsoft.com/office/word/2015/wordml/symex" xmlns:wpg="http://schemas.microsoft.com/office/word/2010/wordprocessingGroup" xmlns:wpi="http://schemas.microsoft.com/office/word/2010/wordprocessingInk" xmlns:wne="http://schemas.microsoft.com/office/word/2006/wordml" xmlns:wps="http://schemas.microsoft.com/office/word/2010/wordprocessingShape" mc:Ignorable="w14 w15 w16se w16cid w16 w16cex w16sdtdh wp14">
+<w:numbering xmlns:wpc="http://schemas.microsoft.com/office/word/2010/wordprocessingCanvas" xmlns:cx="http://schemas.microsoft.com/office/drawing/2014/chartex" xmlns:cx1="http://schemas.microsoft.com/office/drawing/2015/9/8/chartex" xmlns:cx2="http://schemas.microsoft.com/office/drawing/2015/10/21/chartex" xmlns:cx3="http://schemas.microsoft.com/office/drawing/2016/5/9/chartex" xmlns:cx4="http://schemas.microsoft.com/office/drawing/2016/5/10/chartex" xmlns:cx5="http://schemas.microsoft.com/office/drawing/2016/5/11/chartex" xmlns:cx6="http://schemas.microsoft.com/office/drawing/2016/5/12/chartex" xmlns:cx7="http://schemas.microsoft.com/office/drawing/2016/5/13/chartex" xmlns:cx8="http://schemas.microsoft.com/office/drawing/2016/5/14/chartex" xmlns:mc="http://schemas.openxmlformats.org/markup-compatibility/2006" xmlns:aink="http://schemas.microsoft.com/office/drawing/2016/ink" xmlns:am3d="http://schemas.microsoft.com/office/drawing/2017/model3d" xmlns:o="urn:schemas-microsoft-com:office:office" xmlns:r="http://schemas.openxmlformats.org/officeDocument/2006/relationships" xmlns:m="http://schemas.openxmlformats.org/officeDocument/2006/math" xmlns:v="urn:schemas-microsoft-com:vml" xmlns:wp14="http://schemas.microsoft.com/office/word/2010/wordprocessingDrawing" xmlns:wp="http://schemas.openxmlformats.org/drawingml/2006/wordprocessingDrawing" xmlns:w10="urn:schemas-microsoft-com:office:word" xmlns:w="http://schemas.openxmlformats.org/wordprocessingml/2006/main" xmlns:w14="http://schemas.microsoft.com/office/word/2010/wordml" xmlns:w15="http://schemas.microsoft.com/office/word/2012/wordml" xmlns:w16cex="http://schemas.microsoft.com/office/word/2018/wordml/cex" xmlns:w16cid="http://schemas.microsoft.com/office/word/2016/wordml/cid" xmlns:w16="http://schemas.microsoft.com/office/word/2018/wordml" xmlns:w16sdtdh="http://schemas.microsoft.com/office/word/2020/wordml/sdtdatahash" xmlns:w16se="http://schemas.microsoft.com/office/word/2015/wordml/symex" xmlns:wpg="http://schemas.microsoft.com/office/word/2010/wordprocessingGroup" xmlns:wpi="http://schemas.microsoft.com/office/word/2010/wordprocessingInk" xmlns:wne="http://schemas.microsoft.com/office/word/2006/wordml" xmlns:wps="http://schemas.microsoft.com/office/word/2010/wordprocessingShape" mc:Ignorable="w14 w15 w16se w16cid w16 w16cex w16sdtdh wp14">
   <w:abstractNum w:abstractNumId="0" w15:restartNumberingAfterBreak="0">
     <w:nsid w:val="FFFFFF7C"/>
     <w:multiLevelType w:val="singleLevel"/>
@@ -5918,31 +5231,31 @@
       </w:rPr>
     </w:lvl>
   </w:abstractNum>
-  <w:num w:numId="1" w16cid:durableId="1676034380">
+  <w:num w:numId="1">
     <w:abstractNumId w:val="8"/>
   </w:num>
-  <w:num w:numId="2" w16cid:durableId="1132602616">
+  <w:num w:numId="2">
     <w:abstractNumId w:val="6"/>
   </w:num>
-  <w:num w:numId="3" w16cid:durableId="1210259567">
+  <w:num w:numId="3">
     <w:abstractNumId w:val="5"/>
   </w:num>
-  <w:num w:numId="4" w16cid:durableId="2091652301">
+  <w:num w:numId="4">
     <w:abstractNumId w:val="4"/>
   </w:num>
-  <w:num w:numId="5" w16cid:durableId="284191995">
+  <w:num w:numId="5">
     <w:abstractNumId w:val="7"/>
   </w:num>
-  <w:num w:numId="6" w16cid:durableId="516967090">
+  <w:num w:numId="6">
     <w:abstractNumId w:val="3"/>
   </w:num>
-  <w:num w:numId="7" w16cid:durableId="1434932409">
+  <w:num w:numId="7">
     <w:abstractNumId w:val="2"/>
   </w:num>
-  <w:num w:numId="8" w16cid:durableId="1724675617">
+  <w:num w:numId="8">
     <w:abstractNumId w:val="1"/>
   </w:num>
-  <w:num w:numId="9" w16cid:durableId="641890316">
+  <w:num w:numId="9">
     <w:abstractNumId w:val="0"/>
   </w:num>
 </w:numbering>

</xml_diff>